<commit_message>
chore: 테스트 실행 결과물 업데이트 (test_patent.docx, test_patent.hlt)
https://claude.ai/code/session_012XMntHM7R2LNaoSD5H2Nsr
</commit_message>
<xml_diff>
--- a/test_patent.docx
+++ b/test_patent.docx
@@ -12,7 +12,6 @@
         <w:t>인공지능 기반 문서 자동 변환 시스템</w:t>
       </w:r>
     </w:p>
-    <w:p/>
     <w:p>
       <w:r>
         <w:t>【기술분야】</w:t>
@@ -23,7 +22,6 @@
         <w:t>본 발명은 문서 처리 기술에 관한 것으로, 특히 다양한 형식의 문서를 특허 명세서 형식으로 자동 변환하는 시스템에 관한 것이다.</w:t>
       </w:r>
     </w:p>
-    <w:p/>
     <w:p>
       <w:r>
         <w:t>【발명의 배경이 되는 기술】</w:t>
@@ -39,7 +37,6 @@
         <w:t>이러한 방식은 시간이 많이 소요되고 오류가 발생하기 쉬운 문제점이 있었다.</w:t>
       </w:r>
     </w:p>
-    <w:p/>
     <w:p>
       <w:r>
         <w:t>【해결하려는 과제】</w:t>
@@ -50,7 +47,6 @@
         <w:t>본 발명은 상기와 같은 문제점을 해결하기 위한 것으로, 문서 변환을 자동화하여 작업 효율을 높이는 것을 목적으로 한다.</w:t>
       </w:r>
     </w:p>
-    <w:p/>
     <w:p>
       <w:r>
         <w:t>【과제의 해결 수단】</w:t>
@@ -66,7 +62,6 @@
         <w:t>문서 읽기 모듈, 섹션 인식 모듈, HLT 변환 모듈을 포함하는 문서 변환 시스템.</w:t>
       </w:r>
     </w:p>
-    <w:p/>
     <w:p>
       <w:r>
         <w:t>【발명의 효과】</w:t>
@@ -82,7 +77,21 @@
         <w:t>또한 수동 작업에서 발생하는 오류를 방지할 수 있다.</w:t>
       </w:r>
     </w:p>
-    <w:p/>
+    <w:p>
+      <w:r>
+        <w:t>【도면의 간단한 설명】</w:t>
+      </w:r>
+    </w:p>
+    <w:p>
+      <w:r>
+        <w:t>도 1은 본 발명의 실시예에 따른 문서 변환 시스템의 블록도이다.</w:t>
+      </w:r>
+    </w:p>
+    <w:p>
+      <w:r>
+        <w:t>도 2는 본 발명의 실시예에 따른 변환 과정을 나타낸 흐름도이다.</w:t>
+      </w:r>
+    </w:p>
     <w:p>
       <w:r>
         <w:t>【발명을 실시하기 위한 구체적인 내용】</w:t>
@@ -95,7 +104,7 @@
     </w:p>
     <w:p>
       <w:r>
-        <w:t>본 시스템은 Word, HWP, PDF 파일을 입력받아 HLT 형식으로 변환한다.</w:t>
+        <w:t>본 시스템은 Word, HWP 파일을 입력받아 HLT 형식으로 변환한다.</w:t>
       </w:r>
     </w:p>
     <w:p>
@@ -103,31 +112,64 @@
         <w:t>변환 과정에서 문서의 구조를 자동으로 인식하고 해당하는 섹션으로 분류한다.</w:t>
       </w:r>
     </w:p>
-    <w:p/>
     <w:p>
       <w:r>
-        <w:t>【청구범위】</w:t>
+        <w:t>【부호의 설명】</w:t>
       </w:r>
     </w:p>
     <w:p>
       <w:r>
-        <w:t>청구항 1: 문서 파일을 읽는 문서 읽기부; 상기 문서의 섹션을 인식하는 섹션 인식부; 및 인식된 섹션을 HLT 형식으로 변환하는 변환부를 포함하는 특허 문서 변환 시스템.</w:t>
+        <w:t>100: 문서 읽기 모듈</w:t>
       </w:r>
     </w:p>
     <w:p>
       <w:r>
-        <w:t>청구항 2: 제1항에 있어서, 상기 문서 파일은 Word, HWP, PDF 형식 중 하나인 것을 특징으로 하는 특허 문서 변환 시스템.</w:t>
+        <w:t>200: 섹션 인식 모듈</w:t>
       </w:r>
     </w:p>
     <w:p>
       <w:r>
-        <w:t>청구항 3: 제1항에 있어서, 상기 변환부는 한국특허청 표준 XML 형식으로 출력하는 것을 특징으로 하는 특허 문서 변환 시스템.</w:t>
+        <w:t>300: HLT 변환 모듈</w:t>
       </w:r>
     </w:p>
-    <w:p/>
     <w:p>
       <w:r>
-        <w:t>【요약】</w:t>
+        <w:t>【특허청구범위】</w:t>
+      </w:r>
+    </w:p>
+    <w:p>
+      <w:r>
+        <w:t>【청구항 1】</w:t>
+      </w:r>
+    </w:p>
+    <w:p>
+      <w:r>
+        <w:t>문서 파일을 읽는 문서 읽기부; 상기 문서의 섹션을 인식하는 섹션 인식부; 및 인식된 섹션을 HLT 형식으로 변환하는 변환부를 포함하는 특허 문서 변환 시스템.</w:t>
+      </w:r>
+    </w:p>
+    <w:p>
+      <w:r>
+        <w:t>【청구항 2】</w:t>
+      </w:r>
+    </w:p>
+    <w:p>
+      <w:r>
+        <w:t>제1항에 있어서, 상기 문서 파일은 Word, HWP 형식 중 하나인 것을 특징으로 하는 특허 문서 변환 시스템.</w:t>
+      </w:r>
+    </w:p>
+    <w:p>
+      <w:r>
+        <w:t>【청구항 3】</w:t>
+      </w:r>
+    </w:p>
+    <w:p>
+      <w:r>
+        <w:t>제1항에 있어서, 상기 변환부는 한국특허청 표준 XML 형식으로 출력하는 것을 특징으로 하는 특허 문서 변환 시스템.</w:t>
+      </w:r>
+    </w:p>
+    <w:p>
+      <w:r>
+        <w:t>【요약서】</w:t>
       </w:r>
     </w:p>
     <w:p>

</xml_diff>